<commit_message>
Revise section observations and format research recommendations as bullets
</commit_message>
<xml_diff>
--- a/report/Policy_Impact_Counterfactual_Analysis_Report.docx
+++ b/report/Policy_Impact_Counterfactual_Analysis_Report.docx
@@ -158,6 +158,14 @@
     </w:p>
     <w:p>
       <w:pPr>
+        <w:spacing w:after="160"/>
+      </w:pPr>
+      <w:r>
+        <w:t>Observations: The research question concerns the difference between observed U.S. outcomes and an unobserved path without the tightening cycle. The figures can describe what changed after March 2022, but attributing those changes to policy requires additional assumptions about that alternative path. March 2022 provides a reproducible boundary for the analysis. It represents the start of a sequence of policy decisions, however, rather than an isolated treatment; anticipation and subsequent decisions complicate interpretation of a single intervention date.</w:t>
+      </w:r>
+    </w:p>
+    <w:p>
+      <w:pPr>
         <w:pStyle w:val="Heading1"/>
         <w:spacing w:after="160" w:before="360"/>
       </w:pPr>
@@ -187,7 +195,7 @@
         <w:spacing w:after="160"/>
       </w:pPr>
       <w:r>
-        <w:t xml:space="preserve">The full dataset runs from 2006-01-01 to 2026-08-01 at monthly frequency, 230 months of data after cleaning. It is split by date rather than randomly: a pre-intervention window (2006-01-01 to 2022-02-01, 194 months) that the model learns from, and a post-intervention window (2022-03-01 to 2025-02-01, 36 months) that is held out to compare the observed outcome against the model's counterfactual guess.</w:t>
+        <w:t>The cleaned analysis frame spans January 2006-August 2026 and contains 248 monthly rows. Model estimation uses January 2006-February 2022 (194 months), and evaluation uses March 2022-February 2025 (36 months), for 230 modeled observations. The final 18 months in the full frame are outside this evaluation window.</w:t>
       </w:r>
     </w:p>
     <w:p>
@@ -1167,8 +1175,15 @@
         <w:spacing w:after="160"/>
       </w:pPr>
       <w:r>
-        <w:br/>
-        <w:t xml:space="preserve">The three control series come from economies and markets that were not directly subject to the Fed's decision. They let the model separate out inflation and output movements caused by global shocks, most obviously the 2021 to 2022 supply chain and energy shock, from movements caused by the Fed's own choice. That distinction matters, because otherwise the estimated effect would just pick up the shock the Fed was reacting to, not the policy itself.</w:t>
+        <w:t>The foreign inflation and commodity-price series proxy shared global conditions. Their use as controls requires assumptions about exposure to U.S. policy and other central banks' responses; being outside the United States does not establish that a series is untreated.</w:t>
+      </w:r>
+    </w:p>
+    <w:p>
+      <w:pPr>
+        <w:spacing w:after="160"/>
+      </w:pPr>
+      <w:r>
+        <w:t>Observations: The raw-data output contains 260 monthly index entries and nine series, spanning January 2005 to August 2026. The final rows contain missing observations, so the requested retrieval range should not be interpreted as complete coverage for every variable. CPI and PCE measure inflation, industrial production and real GDP capture different aspects of activity, and unemployment adds a labor-market outcome. GDP is quarterly even though it appears on a monthly index; the alignment does not create new monthly measurements. Euro area inflation, UK inflation, and commodity prices provide information about shared global conditions. Their usefulness as predictors does not establish that they are unaffected by U.S. policy or other countries' policy responses. The cached files preserve the inputs used here. Reproducibility depends on retaining that data snapshot, because a later download can contain revised values and different coverage.</w:t>
       </w:r>
     </w:p>
     <w:p>
@@ -1433,6 +1448,14 @@
     </w:p>
     <w:p>
       <w:pPr>
+        <w:spacing w:after="160"/>
+      </w:pPr>
+      <w:r>
+        <w:t>Observations: Preprocessing produces 248 monthly rows from January 2006 to August 2026. The estimation and evaluation windows use 194 and 36 months respectively, for 230 modeled observations; the remaining 18 months are outside the selected evaluation window. Year-over-year transformations express index movements as growth rates, while the policy and unemployment rates remain in levels. Adjacent annual growth observations share much of the same underlying history, so serial dependence remains and stationarity is not guaranteed. The diagnostic reports 15 missing UK CPI values in the full analysis frame. Missingness therefore remains relevant when extending the evaluation period, even though the reported models use the earlier window ending in February 2025. The chronological split and training-only scaling protect the fitted model from direct use of post-intervention outcomes. Forward-filled observations, especially GDP, still require care: a denser index should not be mistaken for additional independent information.</w:t>
+      </w:r>
+    </w:p>
+    <w:p>
+      <w:pPr>
         <w:pStyle w:val="Heading1"/>
         <w:spacing w:after="160" w:before="360"/>
       </w:pPr>
@@ -1499,7 +1522,7 @@
         <w:spacing w:after="160"/>
       </w:pPr>
       <w:r>
-        <w:t xml:space="preserve">The model is fit only on data from before the policy changed. It is then projected forward through the post-intervention window, fed the actual observed control covariates as they happened. That projection is the model's best guess at what the outcome would have done if its existing relationship with its own trend and with global conditions had simply continued, in other words if the Fed had not raised rates. Whatever gap shows up between what actually happened and that projection gets attributed to the policy.</w:t>
+        <w:t>The pre-intervention model is projected forward using observed post-intervention controls. This is a conditional forecast of the historical relationship. Interpreting it as a no-tightening counterfactual additionally requires stable relationships, credible controls, and no omitted concurrent shocks that explain the gap.</w:t>
       </w:r>
     </w:p>
     <w:p>
@@ -1512,7 +1535,7 @@
         <w:spacing w:after="80"/>
       </w:pPr>
       <w:r>
-        <w:t xml:space="preserve">Difference in differences or a classic synthetic control would need a convincing group of untreated countries whose central banks made comparable decisions. That is hard to find here, since most major central banks tightened around the same time, reacting to the same global inflation shock, which would push a cross country comparison toward zero.</w:t>
+        <w:t>Difference-in-differences and synthetic control would require defensible comparison units. Synchronized policy responses complicate their selection, but the same exposure concerns also apply to this model's control series.</w:t>
       </w:r>
     </w:p>
     <w:p>
@@ -1538,7 +1561,7 @@
         <w:spacing w:after="80"/>
       </w:pPr>
       <w:r>
-        <w:t xml:space="preserve">The structural time series approach separates the outcome's own momentum and its co-movement with global conditions from whatever is left over to attribute to the policy, and it produces a full uncertainty band around the counterfactual instead of a single number.</w:t>
+        <w:t>The structural time-series model supplies a transparent baseline and conditional forecast intervals. Its residual gaps may reflect policy, forecast error, and unmodeled shocks; the specification alone does not separate these explanations.</w:t>
       </w:r>
     </w:p>
     <w:p>
@@ -1555,7 +1578,7 @@
         <w:spacing w:after="160"/>
       </w:pPr>
       <w:r>
-        <w:t xml:space="preserve">The intervention date is fixed at March 2022, the first hike of the cycle. The model is estimated once on the training window and then simulated forward for 36 months using statsmodels' get_forecast procedure, which carries both parameter uncertainty and state uncertainty forward into a prediction interval that widens as the horizon stretches out. That widening is the right behavior. Confidence in a counterfactual should drop off the further it gets projected past the last point the model actually saw.</w:t>
+        <w:t>The intervention date is March 2022. The model is estimated on the pre-intervention window and forecast for 36 months using statsmodels get_forecast. The resulting intervals reflect state and observation uncertainty conditional on fitted parameters and supplied controls; they should not be treated as a complete account of parameter or causal uncertainty.</w:t>
       </w:r>
     </w:p>
     <w:p>
@@ -1572,7 +1595,7 @@
         <w:spacing w:after="160"/>
       </w:pPr>
       <w:r>
-        <w:t xml:space="preserve">Before trusting the post-2022 counterfactual, the model needs to prove it can handle a stretch of time where nothing actually happened. So it was fit on data through early 2021 and asked to forecast the last 12 pre-intervention months, March 2021 through February 2022, using the real control covariates from that period. It tracked that known period with an RMSE of 1.24 percentage points and an MAE of 1.1 percentage points, though it lagged a bit behind the actual speed of the 2021 inflation acceleration. That kind of lag is a known weakness of local level models during regime changes, and it comes up again in Section 5.</w:t>
+        <w:t>The CPI backtest has an RMSE of 1.24 percentage points and an MAE of 1.10. Actual inflation exceeds the projection in 11 of 12 months, showing that the model lags the acceleration. This pre-hike holdout is informative about forecast error; it is not a period without other economic shocks, and it cannot validate the unobserved post-policy counterfactual.</w:t>
       </w:r>
     </w:p>
     <w:p>
@@ -1627,14 +1650,7 @@
         <w:jc w:val="center"/>
       </w:pPr>
       <w:r>
-        <w:rPr>
-          <w:i/>
-          <w:iCs/>
-          <w:color w:val="555555"/>
-          <w:sz w:val="20"/>
-          <w:szCs w:val="20"/>
-        </w:rPr>
-        <w:t xml:space="preserve">Figure 4. Model validation: projected vs. actual CPI inflation over a known no-intervention period.</w:t>
+        <w:t>Figure 4. CPI inflation forecast validation over the pre-intervention holdout, March 2021-February 2022.</w:t>
       </w:r>
     </w:p>
     <w:p>
@@ -1660,7 +1676,7 @@
         <w:spacing w:after="160"/>
       </w:pPr>
       <w:r>
-        <w:t xml:space="preserve">Right at the start of the evaluation window, observed and counterfactual CPI inflation sit close together (8.57% actual against 9.6% counterfactual), which makes sense since the policy has not had time to work through the economy yet. By the end of the window, observed inflation had dropped to 2.8%, well under the 4.46% the model thinks would have happened without the hikes. On average the estimated effect works out to -1.65 percentage points a month, adding up to -59.35 percentage point months of disinflation over the full 36 month window.</w:t>
+        <w:t>Observed CPI inflation is 8.57 percent against a 9.60 percent counterfactual in March 2022, and 2.80 percent against 4.46 percent in February 2025. The mean observed-minus-counterfactual gap is -1.65 percentage points across 36 months. Its sum is -59.35 percentage-point months, an accumulation of annual inflation-rate gaps rather than a price-level effect.</w:t>
       </w:r>
     </w:p>
     <w:p>
@@ -1801,7 +1817,7 @@
         <w:spacing w:after="160"/>
       </w:pPr>
       <w:r>
-        <w:t xml:space="preserve">Real GDP only comes out quarterly, which limits how fine grained a monthly counterfactual can be, so industrial production growth stands in as the main output proxy here since it is reported monthly. The average estimated effect on output growth comes out to -2.04 percentage points a month, adding up to -73.57 percentage point months over the window. Observed growth ran below the counterfactual by the end of the window (0.81% against 1.42%), which fits the output cost you would expect from disinflationary tightening.</w:t>
+        <w:t>Industrial production supplies a monthly activity measure, while GDP provides a broader quarterly comparison. The industrial-production growth gap averages -2.04 percentage points and sums to -73.57 percentage-point months. The gap is already -4.54 points in March 2022 and narrows to -0.61 points by February 2025 (0.81 percent observed versus 1.42 percent projected). The large initial discrepancy warrants checking model error and concurrent shocks before assigning it to the first rate increase.</w:t>
       </w:r>
     </w:p>
     <w:p>
@@ -2539,8 +2555,15 @@
         <w:spacing w:after="160"/>
       </w:pPr>
       <w:r>
-        <w:br/>
-        <w:t xml:space="preserve">The sign and rough size of the primary CPI result hold up across the leave one control out checks, so the finding does not look like it depends on any single control series. The PCE based estimate backs up the CPI based one. What stands out most is that the unemployment rate also came in below its counterfactual, the opposite of what the textbook tradeoff predicts, since tightening is supposed to push unemployment up, and it lines up with the soft landing story a lot of people told about this cycle. Real GDP growth shows a much smaller effect than industrial production, which is probably just the smoothing that comes from stretching a quarterly series out to monthly frequency.</w:t>
+        <w:t>The leave-one-control-out CPI estimates range from -1.36 to -2.79 percentage points, compared with the -1.65 baseline. The negative sign persists, but the magnitude is sensitive to control selection, particularly omission of commodity prices. The negative PCE estimate provides agreement across inflation measures under shared assumptions. Unemployment and GDP are secondary outcomes, rather than independent validation of the CPI result.</w:t>
+      </w:r>
+    </w:p>
+    <w:p>
+      <w:pPr>
+        <w:spacing w:after="160"/>
+      </w:pPr>
+      <w:r>
+        <w:t>Methodological observations: The 12-month CPI backtest yields an RMSE of 1.24 percentage points and an MAE of 1.10. The model underpredicts inflation in 11 of the 12 months, indicating directional error during the 2021 acceleration. This is a material limitation of the baseline rather than evidence that the counterfactual has been validated causally. The model estimates average observed-minus-counterfactual gaps of -1.65 percentage points for CPI inflation and -2.04 for industrial production growth. The industrial-production gap is already -4.54 points in March 2022, which warrants checking anticipation, initial forecast error, and concurrent shocks before interpreting it as a response to the first hike. Dropping individual controls leaves the CPI estimate negative but moves it from -1.36 to -2.79 percentage points. Removing commodity prices produces the largest change from the -1.65 baseline. The sign is stable within these specifications; the magnitude is meaningfully sensitive to the control set. The prediction bands describe uncertainty within the fitted forecasting model. They do not account for every source of causal uncertainty, including contaminated controls and omitted shocks, and the single CPI backtest does not establish predictive reliability for the other outcomes.</w:t>
       </w:r>
     </w:p>
     <w:p>
@@ -2607,6 +2630,14 @@
     </w:p>
     <w:p>
       <w:pPr>
+        <w:spacing w:after="160"/>
+      </w:pPr>
+      <w:r>
+        <w:t>Observations: Across March 2022-February 2025, the average gaps are -1.65 percentage points for CPI inflation, -1.35 for PCE inflation, and -2.04 for industrial production growth. Both inflation measures support the same direction of departure from their projected paths, although they share the same modeling assumptions. The unemployment gap is -0.50 percentage points and the real GDP growth gap is -0.06. These estimates do not support a uniform deterioration across activity and labor-market outcomes. They also do not establish that tightening reduced unemployment or caused a soft landing. The summary chart displays point estimates without their uncertainty. Differences in bar length should therefore not be read as differences in statistical significance or as directly comparable welfare costs. The cumulative CPI gap of -59.35 percentage-point months sums monthly differences in annual inflation rates. It is neither a 59.35 percent reduction in the price level nor evidence of a compounding policy mechanism; recovering a price-level effect would require a separate calculation.</w:t>
+      </w:r>
+    </w:p>
+    <w:p>
+      <w:pPr>
         <w:pStyle w:val="Heading1"/>
         <w:spacing w:after="160" w:before="360"/>
       </w:pPr>
@@ -2628,7 +2659,7 @@
         <w:spacing w:after="160"/>
       </w:pPr>
       <w:r>
-        <w:t xml:space="preserve">In the short term, the first twelve months after the first hike through roughly March 2023, the gap between actual and counterfactual CPI inflation starts out small and grows over the year. That fits the old idea of monetary policy working with long and variable lags: rate hikes take time to work through borrowing, investment, and demand, so the disinflationary effect should build up gradually rather than show up right away.</w:t>
+        <w:t>During the first 12 evaluation months, March 2022-February 2023, the CPI gap moves from -1.03 to -2.61 percentage points. This pattern is consistent with a delayed response, but the gap already present at intervention and the backtest's directional errors prevent the timing alone from identifying monetary transmission.</w:t>
       </w:r>
     </w:p>
     <w:p>
@@ -2636,7 +2667,7 @@
         <w:spacing w:after="160"/>
       </w:pPr>
       <w:r>
-        <w:t xml:space="preserve">Looking further out, through the end of the evaluation window, the cumulative effect keeps growing, which points to a lasting, compounding disinflationary effect rather than a one time shift. The output side result should be read next to the inflation result, as the other half of the usual monetary policy tradeoff, not as some separate finding. Bringing inflation down faster than the economy would have managed on its own tends to cost something in growth, and the industrial production numbers here fit that pattern. The unemployment result muddies that simple story a bit, and that gets discussed below.</w:t>
+        <w:t>By February 2025, CPI inflation is 2.80 percent against a 4.46 percent counterfactual. The cumulative gap records accumulated differences over the window; it does not establish that the effect compounds or persists beyond the evaluation horizon. The industrial-production result suggests weaker activity relative to its baseline, while the near-zero average GDP gap and negative unemployment gap complicate a simple output-employment tradeoff.</w:t>
       </w:r>
     </w:p>
     <w:p>
@@ -2658,7 +2689,7 @@
         <w:spacing w:after="80"/>
       </w:pPr>
       <w:r>
-        <w:t xml:space="preserve">Treating the controls as untouched by the policy is an approximation, not something guaranteed. Euro area and UK inflation were affected by their own central banks tightening, just a bit later than the Fed, and global commodity prices are not fully cut off from U.S. monetary policy either, mostly through the dollar exchange rate. If the controls were partly caught up in the same global tightening cycle, this analysis probably understates how big the Fed's real effect was.</w:t>
+        <w:t>The controls may be affected by U.S. spillovers and synchronized foreign tightening. Their resulting bias need not have a known direction; it should be assessed through sensitivity analysis rather than assumed to understate the policy effect.</w:t>
       </w:r>
     </w:p>
     <w:p>
@@ -2684,7 +2715,7 @@
         <w:spacing w:after="80"/>
       </w:pPr>
       <w:r>
-        <w:t xml:space="preserve">The model assumes the outcome's underlying trend moves smoothly. The backtest in Section 3.4 shows it can lag behind sharp accelerations, and that same weakness probably shows up somewhere in the actual post-intervention series too.</w:t>
+        <w:t>The local-level specification permits a changing latent level but retains fixed regression relationships. The directional errors in the CPI holdout indicate vulnerability during rapid changes. Predictive checks for the other outcomes are also needed.</w:t>
       </w:r>
     </w:p>
     <w:p>
@@ -2697,7 +2728,7 @@
         <w:spacing w:after="80"/>
       </w:pPr>
       <w:r>
-        <w:t xml:space="preserve">Stretching GDP growth from quarterly to monthly data adds extra smoothing, which is worth keeping in mind when reading that particular result.</w:t>
+        <w:t>Aligning quarterly GDP to a monthly index repeats lower-frequency information. The near-zero average GDP gap cannot be attributed to smoothing alone without a separate comparison at the native quarterly frequency.</w:t>
       </w:r>
     </w:p>
     <w:p>
@@ -2710,7 +2741,7 @@
         <w:spacing w:after="80"/>
       </w:pPr>
       <w:r>
-        <w:t xml:space="preserve">The widening prediction bands in Figures 5 and 7 are supposed to happen. A counterfactual gets less certain the further it is projected past the last real observation. Wherever the observed series sits close to the edge of that band, the estimated effect there is not really distinguishable from noise, even if the number itself looks big.</w:t>
+        <w:t>The plotted intervals are conditional on the fitted state-space specification and observed controls. Observations inside a pointwise prediction band are compatible with that forecast at its stated nominal level; observations outside it indicate a discrepancy, not proof of a policy effect. Cumulative inference additionally requires the dependence between forecast errors. Model misspecification and uncertainty about identification remain outside these bands.</w:t>
       </w:r>
     </w:p>
     <w:p>
@@ -2719,7 +2750,7 @@
         <w:spacing w:after="120" w:before="280"/>
       </w:pPr>
       <w:r>
-        <w:t xml:space="preserve">5.3 Observations from an AI/ML Research Perspective</w:t>
+        <w:t>5.3 Final Insights and Recommendations from an AI Research Perspective</w:t>
       </w:r>
     </w:p>
     <w:p>
@@ -2727,85 +2758,91 @@
         <w:spacing w:after="160"/>
       </w:pPr>
       <w:r>
-        <w:t xml:space="preserve">A few things stood out while building this pipeline, worth pointing out since they connect this fairly classical econometric exercise to open questions in causal machine learning right now.</w:t>
+        <w:t>The empirical results motivate the following research conclusions and priorities. These recommendations distinguish what the current experiment demonstrates from extensions that remain to be tested.</w:t>
       </w:r>
     </w:p>
     <w:p>
       <w:pPr>
         <w:pStyle w:val="ListParagraph"/>
+        <w:spacing w:after="80"/>
         <w:numPr>
           <w:ilvl w:val="0"/>
           <w:numId w:val="1"/>
         </w:numPr>
+        <w:ind w:left="360" w:hanging="240"/>
+      </w:pPr>
+      <w:r>
+        <w:t>The central finding is a consistent negative inflation gap within the specifications examined: CPI inflation averages 1.65 percentage points below its counterfactual, and PCE inflation averages 1.35 points below. I interpret this as evidence consistent with a disinflationary contribution from tightening, conditional on the model's assumptions. The analysis does not independently identify how much of the decline was caused by the Federal Reserve.</w:t>
+      </w:r>
+    </w:p>
+    <w:p>
+      <w:pPr>
+        <w:pStyle w:val="ListParagraph"/>
         <w:spacing w:after="80"/>
-      </w:pPr>
-      <w:r>
-        <w:t xml:space="preserve">A simple state space model is the right amount of complexity for this sample size. With only 194 pre-intervention monthly observations, a more expressive model, an LSTM, a temporal transformer, some other deep sequence model, would almost certainly overfit the training window and produce a less trustworthy counterfactual than the local level Kalman filter model used here, even though it would look more impressive on paper. Model capacity should match the sample size, not whatever happens to be popular in the literature right now.</w:t>
-      </w:r>
-    </w:p>
-    <w:p>
-      <w:pPr>
-        <w:pStyle w:val="ListParagraph"/>
         <w:numPr>
           <w:ilvl w:val="0"/>
           <w:numId w:val="1"/>
         </w:numPr>
+        <w:ind w:left="360" w:hanging="240"/>
+      </w:pPr>
+      <w:r>
+        <w:t>For an AI researcher, the main lesson is that predictive performance and causal identification require separate scrutiny. The local-level model is a transparent baseline for 194 training observations, but the 2021 backtest exposes persistent underprediction. Greater model capacity is worth considering only if it improves temporally held-out performance and calibration; no comparison in this project establishes that neural models would necessarily overfit or that the present model is optimal.</w:t>
+      </w:r>
+    </w:p>
+    <w:p>
+      <w:pPr>
+        <w:pStyle w:val="ListParagraph"/>
         <w:spacing w:after="80"/>
-      </w:pPr>
-      <w:r>
-        <w:t xml:space="preserve">The assumption that the control covariates are untouched by the policy is exactly the assumption double and orthogonal machine learning (Chernozhukov et al., 2018) was built to relax. A natural extension of this project would be swapping the linear regression on the controls for a debiased ML estimator, through EconML or DoWhy for example, which would make the counterfactual less sensitive to getting the relationship between controls and outcome wrong, even though the assumption that the controls themselves are untreated would still need to hold.</w:t>
-      </w:r>
-    </w:p>
-    <w:p>
-      <w:pPr>
-        <w:pStyle w:val="ListParagraph"/>
         <w:numPr>
           <w:ilvl w:val="0"/>
           <w:numId w:val="1"/>
         </w:numPr>
+        <w:ind w:left="360" w:hanging="240"/>
+      </w:pPr>
+      <w:r>
+        <w:t>Validation should be the first extension. I would use several rolling pre-intervention holdouts, report signed forecast error and interval coverage alongside RMSE, and repeat these checks for industrial production and the secondary outcomes. Placebo intervention dates would help reveal whether the procedure generates sustained gaps in other periods; their interpretation must account for serial dependence and other economic shocks.</w:t>
+      </w:r>
+    </w:p>
+    <w:p>
+      <w:pPr>
+        <w:pStyle w:val="ListParagraph"/>
         <w:spacing w:after="80"/>
-      </w:pPr>
-      <w:r>
-        <w:t xml:space="preserve">The leave one control out check here is basically a lightweight version of feature ablation studies in ML research. A stronger diagnostic borrowed from the synthetic control and CausalImpact literature would be a placebo or permutation test: rerun the whole pipeline with several fake intervention dates where nothing actually happened and check that the estimated effect collapses to noise. That would be the next thing to add if this were being prepared for a methods focused audience instead of a course submission.</w:t>
-      </w:r>
-    </w:p>
-    <w:p>
-      <w:pPr>
-        <w:pStyle w:val="ListParagraph"/>
         <w:numPr>
           <w:ilvl w:val="0"/>
           <w:numId w:val="1"/>
         </w:numPr>
+        <w:ind w:left="360" w:hanging="240"/>
+      </w:pPr>
+      <w:r>
+        <w:t>The next priority is sensitivity of the identifying assumptions. The CPI estimate changes from -1.36 to -2.79 percentage points when controls are removed, so donor selection deserves as much attention as the forecasting algorithm. A larger donor panel or regularized factor model could provide alternative baselines, but each donor still needs a defensible exposure assessment. Financial conditions may transmit monetary policy and should not be added mechanically as controls when estimating its total effect.</w:t>
+      </w:r>
+    </w:p>
+    <w:p>
+      <w:pPr>
+        <w:pStyle w:val="ListParagraph"/>
         <w:spacing w:after="80"/>
-      </w:pPr>
-      <w:r>
-        <w:t xml:space="preserve">The widening prediction interval is the same thing as growing epistemic uncertainty under distribution shift in ML models. The interval here comes from a Gaussian state space assumption, and a distribution free alternative worth trying is conformal prediction, which gives a valid coverage guarantee without assuming Gaussian errors on macro data that everyone knows has fat tails.</w:t>
-      </w:r>
-    </w:p>
-    <w:p>
-      <w:pPr>
-        <w:pStyle w:val="ListParagraph"/>
         <w:numPr>
           <w:ilvl w:val="0"/>
           <w:numId w:val="1"/>
         </w:numPr>
+        <w:ind w:left="360" w:hanging="240"/>
+      </w:pPr>
+      <w:r>
+        <w:t>Uncertainty should be assessed over complete forecast paths, including the dependence between monthly errors, before drawing conclusions about average or cumulative effects. Time-series conformal methods could be evaluated as a calibration extension, but standard conformal coverage does not automatically survive serial dependence or distribution shift. Likewise, double machine learning can address aspects of nuisance-function estimation under an appropriate causal design; it does not remove the need to justify identification or repair policy-affected controls by itself.</w:t>
+      </w:r>
+    </w:p>
+    <w:p>
+      <w:pPr>
+        <w:pStyle w:val="ListParagraph"/>
         <w:spacing w:after="80"/>
-      </w:pPr>
-      <w:r>
-        <w:t xml:space="preserve">Treating the control covariate selection as fixed and hand picked, Euro area inflation, UK inflation, commodity prices, is probably the weakest link in the whole design. A version closer to how modern AI research would approach this would learn the donor weights directly, for example by framing the pre-intervention fit as a matrix completion or low rank factor problem over a much bigger panel of countries and series, letting the data pick the synthetic control instead of a researcher's judgment call.</w:t>
-      </w:r>
-    </w:p>
-    <w:p>
-      <w:pPr>
-        <w:pStyle w:val="ListParagraph"/>
         <w:numPr>
           <w:ilvl w:val="0"/>
           <w:numId w:val="1"/>
         </w:numPr>
-        <w:spacing w:after="80"/>
-      </w:pPr>
-      <w:r>
-        <w:t xml:space="preserve">Building the pipeline as versioned, callable modules instead of ad hoc notebook cells is the same discipline reproducible ML work needs anyway: deterministic data pulls, cached raw inputs, no hidden state carried between cells. That discipline is what makes it possible to rerun this whole thing months from now and get the exact same figures, and that matters just as much for a causal inference claim as it does for a trained model.</w:t>
+        <w:ind w:left="360" w:hanging="240"/>
+      </w:pPr>
+      <w:r>
+        <w:t>For policy interpretation, the inflation results should be considered alongside the industrial-production, GDP, and unemployment estimates, which tell a less uniform story. This exercise does not estimate an optimal rate path or a welfare tradeoff. My recommendation is to use the counterfactual as one conditional diagnostic, strengthen validation and control sensitivity before extending the horizon, and preserve the raw-data snapshot and software environment so that revisions can be distinguished from methodological changes.</w:t>
       </w:r>
     </w:p>
     <w:p>
@@ -2831,7 +2868,7 @@
         <w:spacing w:after="160"/>
       </w:pPr>
       <w:r>
-        <w:t xml:space="preserve">Using a structural time series counterfactual that was checked against a known no intervention period, this analysis finds that the Fed's 2022 tightening cycle lines up with CPI inflation running measurably below the path it would have followed otherwise, with that gap growing over the year after the first hike. That matches the lagged disinflationary effect tightening is supposed to have. Industrial production growth also ran below its counterfactual, which fits the output cost that disinflation usually carries, while unemployment came in below its counterfactual too, a pattern that matches the soft landing story a lot of commentators told about this cycle. The robustness checks, across different outcomes and control sets, back up the direction and rough size of the main inflation result.</w:t>
+        <w:t>Over the 36-month evaluation window, observed CPI and PCE inflation lie below their model-based counterfactuals on average, alongside a negative industrial-production growth gap. The GDP and unemployment results show that the estimated pattern is not a uniform contraction across outcomes. The findings are consistent with disinflation following tightening, but their causal interpretation remains conditional on stable pre-policy relationships, credible controls, and the absence of unmodeled concurrent shocks.</w:t>
       </w:r>
     </w:p>
     <w:p>
@@ -2848,7 +2885,7 @@
         <w:spacing w:after="160"/>
       </w:pPr>
       <w:r>
-        <w:t xml:space="preserve">These results line up with the standard view that monetary tightening works with a lag and builds up over time, which is an argument for policymakers weighing the cumulative effect, not just where things stand at any one moment, when deciding how long to keep policy tight. They also make the case for tracking counterfactual estimates in real time, with honest uncertainty bands, instead of leaning on raw before and after comparisons that would have mixed the Fed's effect together with the global inflation shock that was fading for its own separate reasons at the same time.</w:t>
+        <w:t>The immediate research priority is to test the reliability of this interpretation through repeated temporal validation, placebo dates, and alternative control sets. Any policy discussion should retain the uncertainty around the estimates and distinguish an accumulated forecast gap from evidence of a lasting causal mechanism. The present design cannot determine how long interest rates should remain restrictive or isolate the effect of each decision within the tightening cycle.</w:t>
       </w:r>
     </w:p>
     <w:p>
@@ -2856,7 +2893,7 @@
         <w:spacing w:after="160"/>
       </w:pPr>
       <w:r>
-        <w:t xml:space="preserve">A few directions for future work. Extend the evaluation window as more data comes in, to see whether the cumulative effect settles down. Add an actual cross country synthetic control, weighting a pool of economies whose central banks moved on different schedules, as an independent check on the structural time series result used here. And bring in financial conditions indices as extra controls, to separate the policy rate channel from other tightening channels, like quantitative tightening, that were moving at the same time.</w:t>
+        <w:t>Future work should prioritize repeated temporal validation and sensitivity to control exposure, then compare alternative counterfactual models under the same evaluation protocol. Extending the window requires checking missing control observations and data revisions. Preserve the input snapshot and software environment, and report changes in estimates alongside changes in data and specification.</w:t>
       </w:r>
     </w:p>
     <w:p>
@@ -2890,6 +2927,22 @@
       </w:pPr>
       <w:r>
         <w:t xml:space="preserve">Federal Reserve Economic Data (FRED), Federal Reserve Bank of St. Louis. https://fred.stlouisfed.org/</w:t>
+      </w:r>
+    </w:p>
+    <w:p>
+      <w:pPr>
+        <w:spacing w:after="160"/>
+      </w:pPr>
+      <w:r>
+        <w:t>Chernozhukov et al. (2018). Double/debiased machine learning for treatment and structural parameters. The Econometrics Journal, 21(1), C1-C68. https://academic.oup.com/ectj/article/21/1/C1/5056401</w:t>
+      </w:r>
+    </w:p>
+    <w:p>
+      <w:pPr>
+        <w:spacing w:after="160"/>
+      </w:pPr>
+      <w:r>
+        <w:t>Barber, Candes, Ramdas, and Tibshirani. Conformal prediction beyond exchangeability. https://arxiv.org/abs/2202.13415</w:t>
       </w:r>
     </w:p>
     <w:sectPr>

</xml_diff>